<commit_message>
all added github links
</commit_message>
<xml_diff>
--- a/contributors/kemmy-kk-web/report/Diabetes_Prediction_Report.docx
+++ b/contributors/kemmy-kk-web/report/Diabetes_Prediction_Report.docx
@@ -68,41 +68,25 @@
           <w:sz w:val="18"/>
           <w:szCs w:val="18"/>
         </w:rPr>
-        <w:t>_____________     supervisor</w:t>
-      </w:r>
+        <w:t xml:space="preserve">_____________     supervisor: Gita </w:t>
+      </w:r>
+      <w:proofErr w:type="spellStart"/>
       <w:r>
         <w:rPr>
           <w:color w:val="595959"/>
           <w:sz w:val="18"/>
           <w:szCs w:val="18"/>
         </w:rPr>
-        <w:t xml:space="preserve">: Gita </w:t>
-      </w:r>
-      <w:proofErr w:type="spellStart"/>
+        <w:t>Fonyuy</w:t>
+      </w:r>
+      <w:proofErr w:type="spellEnd"/>
       <w:r>
         <w:rPr>
           <w:color w:val="595959"/>
           <w:sz w:val="18"/>
           <w:szCs w:val="18"/>
         </w:rPr>
-        <w:t>Fonyuy</w:t>
-      </w:r>
-      <w:proofErr w:type="spellEnd"/>
-      <w:r>
-        <w:rPr>
-          <w:color w:val="595959"/>
-          <w:sz w:val="18"/>
-          <w:szCs w:val="18"/>
-        </w:rPr>
-        <w:t>______________     Date: __05/10/2026</w:t>
-      </w:r>
-      <w:r>
-        <w:rPr>
-          <w:color w:val="595959"/>
-          <w:sz w:val="18"/>
-          <w:szCs w:val="18"/>
-        </w:rPr>
-        <w:t>____________</w:t>
+        <w:t>______________     Date: __05/10/2026____________</w:t>
       </w:r>
     </w:p>
     <w:p>
@@ -156,13 +140,7 @@
         <w:spacing w:after="120" w:line="280" w:lineRule="auto"/>
       </w:pPr>
       <w:r>
-        <w:t>Di</w:t>
-      </w:r>
-      <w:r>
-        <w:t>abetes can cause serious health problems if not caught early, but many people are not tested until symptoms appear. This project asks: can we predict diabetes risk from simple health data? The dataset (Pima Indians Diabetes Dataset) has 768 patients: 500 w</w:t>
-      </w:r>
-      <w:r>
-        <w:t>ithout diabetes and 268 with diabetes.</w:t>
+        <w:t>Diabetes can cause serious health problems if not caught early, but many people are not tested until symptoms appear. This project asks: can we predict diabetes risk from simple health data? The dataset (Pima Indians Diabetes Dataset) has 768 patients: 500 without diabetes and 268 with diabetes.</w:t>
       </w:r>
     </w:p>
     <w:p>
@@ -189,10 +167,7 @@
         <w:spacing w:after="120" w:line="280" w:lineRule="auto"/>
       </w:pPr>
       <w:r>
-        <w:t>The plan: (1) explore the data, (2) clean it and engineer new features, (3) build and train an ANN, and (4) evaluate it on unseen data. An ANN was chosen because it can learn how risk factors comb</w:t>
-      </w:r>
-      <w:r>
-        <w:t>ine, not just look at each one alone.</w:t>
+        <w:t>The plan: (1) explore the data, (2) clean it and engineer new features, (3) build and train an ANN, and (4) evaluate it on unseen data. An ANN was chosen because it can learn how risk factors combine, not just look at each one alone.</w:t>
       </w:r>
     </w:p>
     <w:p>
@@ -219,10 +194,7 @@
         <w:spacing w:after="120" w:line="280" w:lineRule="auto"/>
       </w:pPr>
       <w:r>
-        <w:t>The 768 records were split into training (537), validation (115), and test (116) sets. Biologically impossible zero values (in Glucose, Blood Pressure, Skin Thickness, Insulin, BMI) were repla</w:t>
-      </w:r>
-      <w:r>
-        <w:t xml:space="preserve">ced with the training median. Six new features were engineered, including </w:t>
+        <w:t xml:space="preserve">The 768 records were split into training (537), validation (115), and test (116) sets. Biologically impossible zero values (in Glucose, Blood Pressure, Skin Thickness, Insulin, BMI) were replaced with the training median. Six new features were engineered, including </w:t>
       </w:r>
       <w:proofErr w:type="spellStart"/>
       <w:r>
@@ -287,12 +259,6 @@
         <w:gridCol w:w="6800"/>
       </w:tblGrid>
       <w:tr>
-        <w:tblPrEx>
-          <w:tblCellMar>
-            <w:top w:w="0" w:type="dxa"/>
-            <w:bottom w:w="0" w:type="dxa"/>
-          </w:tblCellMar>
-        </w:tblPrEx>
         <w:trPr>
           <w:tblHeader/>
         </w:trPr>
@@ -346,12 +312,6 @@
         </w:tc>
       </w:tr>
       <w:tr>
-        <w:tblPrEx>
-          <w:tblCellMar>
-            <w:top w:w="0" w:type="dxa"/>
-            <w:bottom w:w="0" w:type="dxa"/>
-          </w:tblCellMar>
-        </w:tblPrEx>
         <w:tc>
           <w:tcPr>
             <w:tcW w:w="2600" w:type="dxa"/>
@@ -386,23 +346,13 @@
             </w:tcMar>
           </w:tcPr>
           <w:p>
-            <w:proofErr w:type="gramStart"/>
-            <w:r>
-              <w:rPr>
-                <w:color w:val="000000"/>
-                <w:sz w:val="18"/>
-                <w:szCs w:val="18"/>
-              </w:rPr>
-              <w:t>Dense(</w:t>
-            </w:r>
-            <w:proofErr w:type="gramEnd"/>
-            <w:r>
-              <w:rPr>
-                <w:color w:val="000000"/>
-                <w:sz w:val="18"/>
-                <w:szCs w:val="18"/>
-              </w:rPr>
-              <w:t xml:space="preserve">128) + </w:t>
+            <w:r>
+              <w:rPr>
+                <w:color w:val="000000"/>
+                <w:sz w:val="18"/>
+                <w:szCs w:val="18"/>
+              </w:rPr>
+              <w:t xml:space="preserve">Dense(128) + </w:t>
             </w:r>
             <w:proofErr w:type="spellStart"/>
             <w:r>
@@ -444,12 +394,6 @@
         </w:tc>
       </w:tr>
       <w:tr>
-        <w:tblPrEx>
-          <w:tblCellMar>
-            <w:top w:w="0" w:type="dxa"/>
-            <w:bottom w:w="0" w:type="dxa"/>
-          </w:tblCellMar>
-        </w:tblPrEx>
         <w:tc>
           <w:tcPr>
             <w:tcW w:w="2600" w:type="dxa"/>
@@ -484,23 +428,13 @@
             </w:tcMar>
           </w:tcPr>
           <w:p>
-            <w:proofErr w:type="gramStart"/>
-            <w:r>
-              <w:rPr>
-                <w:color w:val="000000"/>
-                <w:sz w:val="18"/>
-                <w:szCs w:val="18"/>
-              </w:rPr>
-              <w:t>Dense(</w:t>
-            </w:r>
-            <w:proofErr w:type="gramEnd"/>
-            <w:r>
-              <w:rPr>
-                <w:color w:val="000000"/>
-                <w:sz w:val="18"/>
-                <w:szCs w:val="18"/>
-              </w:rPr>
-              <w:t xml:space="preserve">64) + </w:t>
+            <w:r>
+              <w:rPr>
+                <w:color w:val="000000"/>
+                <w:sz w:val="18"/>
+                <w:szCs w:val="18"/>
+              </w:rPr>
+              <w:t xml:space="preserve">Dense(64) + </w:t>
             </w:r>
             <w:proofErr w:type="spellStart"/>
             <w:r>
@@ -542,12 +476,6 @@
         </w:tc>
       </w:tr>
       <w:tr>
-        <w:tblPrEx>
-          <w:tblCellMar>
-            <w:top w:w="0" w:type="dxa"/>
-            <w:bottom w:w="0" w:type="dxa"/>
-          </w:tblCellMar>
-        </w:tblPrEx>
         <w:tc>
           <w:tcPr>
             <w:tcW w:w="2600" w:type="dxa"/>
@@ -582,23 +510,13 @@
             </w:tcMar>
           </w:tcPr>
           <w:p>
-            <w:proofErr w:type="gramStart"/>
-            <w:r>
-              <w:rPr>
-                <w:color w:val="000000"/>
-                <w:sz w:val="18"/>
-                <w:szCs w:val="18"/>
-              </w:rPr>
-              <w:t>Dense(</w:t>
-            </w:r>
-            <w:proofErr w:type="gramEnd"/>
-            <w:r>
-              <w:rPr>
-                <w:color w:val="000000"/>
-                <w:sz w:val="18"/>
-                <w:szCs w:val="18"/>
-              </w:rPr>
-              <w:t xml:space="preserve">32) + </w:t>
+            <w:r>
+              <w:rPr>
+                <w:color w:val="000000"/>
+                <w:sz w:val="18"/>
+                <w:szCs w:val="18"/>
+              </w:rPr>
+              <w:t xml:space="preserve">Dense(32) + </w:t>
             </w:r>
             <w:proofErr w:type="spellStart"/>
             <w:r>
@@ -622,12 +540,6 @@
         </w:tc>
       </w:tr>
       <w:tr>
-        <w:tblPrEx>
-          <w:tblCellMar>
-            <w:top w:w="0" w:type="dxa"/>
-            <w:bottom w:w="0" w:type="dxa"/>
-          </w:tblCellMar>
-        </w:tblPrEx>
         <w:tc>
           <w:tcPr>
             <w:tcW w:w="2600" w:type="dxa"/>
@@ -662,23 +574,13 @@
             </w:tcMar>
           </w:tcPr>
           <w:p>
-            <w:proofErr w:type="gramStart"/>
-            <w:r>
-              <w:rPr>
-                <w:color w:val="000000"/>
-                <w:sz w:val="18"/>
-                <w:szCs w:val="18"/>
-              </w:rPr>
-              <w:t>Dense(</w:t>
-            </w:r>
-            <w:proofErr w:type="gramEnd"/>
-            <w:r>
-              <w:rPr>
-                <w:color w:val="000000"/>
-                <w:sz w:val="18"/>
-                <w:szCs w:val="18"/>
-              </w:rPr>
-              <w:t>1) + Sigmoid</w:t>
+            <w:r>
+              <w:rPr>
+                <w:color w:val="000000"/>
+                <w:sz w:val="18"/>
+                <w:szCs w:val="18"/>
+              </w:rPr>
+              <w:t>Dense(1) + Sigmoid</w:t>
             </w:r>
           </w:p>
         </w:tc>
@@ -740,10 +642,7 @@
         <w:spacing w:after="120" w:line="280" w:lineRule="auto"/>
       </w:pPr>
       <w:r>
-        <w:t>Glucose has the strongest link to</w:t>
-      </w:r>
-      <w:r>
-        <w:t xml:space="preserve"> diabetes (correlation 0.50), followed by Insulin (0.38) and BMI (0.32). The data is imbalanced (65% no diabetes, 35% diabetes), so accuracy alone isn't enough — AUC, precision, and recall were also tracked.</w:t>
+        <w:t>Glucose has the strongest link to diabetes (correlation 0.50), followed by Insulin (0.38) and BMI (0.32). The data is imbalanced (65% no diabetes, 35% diabetes), so accuracy alone isn't enough — AUC, precision, and recall were also tracked.</w:t>
       </w:r>
     </w:p>
     <w:p>
@@ -809,17 +708,7 @@
           <w:sz w:val="16"/>
           <w:szCs w:val="16"/>
         </w:rPr>
-        <w:t>Figure 1: EDA – feature distributions and corr</w:t>
-      </w:r>
-      <w:r>
-        <w:rPr>
-          <w:i/>
-          <w:iCs/>
-          <w:color w:val="595959"/>
-          <w:sz w:val="16"/>
-          <w:szCs w:val="16"/>
-        </w:rPr>
-        <w:t>elation matrix</w:t>
+        <w:t>Figure 1: EDA – feature distributions and correlation matrix</w:t>
       </w:r>
     </w:p>
     <w:tbl>
@@ -844,12 +733,6 @@
         <w:gridCol w:w="4700"/>
       </w:tblGrid>
       <w:tr>
-        <w:tblPrEx>
-          <w:tblCellMar>
-            <w:top w:w="0" w:type="dxa"/>
-            <w:bottom w:w="0" w:type="dxa"/>
-          </w:tblCellMar>
-        </w:tblPrEx>
         <w:trPr>
           <w:tblHeader/>
         </w:trPr>
@@ -903,12 +786,6 @@
         </w:tc>
       </w:tr>
       <w:tr>
-        <w:tblPrEx>
-          <w:tblCellMar>
-            <w:top w:w="0" w:type="dxa"/>
-            <w:bottom w:w="0" w:type="dxa"/>
-          </w:tblCellMar>
-        </w:tblPrEx>
         <w:tc>
           <w:tcPr>
             <w:tcW w:w="4700" w:type="dxa"/>
@@ -955,12 +832,6 @@
         </w:tc>
       </w:tr>
       <w:tr>
-        <w:tblPrEx>
-          <w:tblCellMar>
-            <w:top w:w="0" w:type="dxa"/>
-            <w:bottom w:w="0" w:type="dxa"/>
-          </w:tblCellMar>
-        </w:tblPrEx>
         <w:tc>
           <w:tcPr>
             <w:tcW w:w="4700" w:type="dxa"/>
@@ -1007,12 +878,6 @@
         </w:tc>
       </w:tr>
       <w:tr>
-        <w:tblPrEx>
-          <w:tblCellMar>
-            <w:top w:w="0" w:type="dxa"/>
-            <w:bottom w:w="0" w:type="dxa"/>
-          </w:tblCellMar>
-        </w:tblPrEx>
         <w:tc>
           <w:tcPr>
             <w:tcW w:w="4700" w:type="dxa"/>
@@ -1059,12 +924,6 @@
         </w:tc>
       </w:tr>
       <w:tr>
-        <w:tblPrEx>
-          <w:tblCellMar>
-            <w:top w:w="0" w:type="dxa"/>
-            <w:bottom w:w="0" w:type="dxa"/>
-          </w:tblCellMar>
-        </w:tblPrEx>
         <w:tc>
           <w:tcPr>
             <w:tcW w:w="4700" w:type="dxa"/>
@@ -1126,7 +985,6 @@
         <w:t xml:space="preserve">(Fill in from your notebook's </w:t>
       </w:r>
       <w:proofErr w:type="spellStart"/>
-      <w:proofErr w:type="gramStart"/>
       <w:r>
         <w:rPr>
           <w:i/>
@@ -1138,7 +996,6 @@
         <w:t>model.evaluate</w:t>
       </w:r>
       <w:proofErr w:type="spellEnd"/>
-      <w:proofErr w:type="gramEnd"/>
       <w:r>
         <w:rPr>
           <w:i/>
@@ -1206,10 +1063,7 @@
         <w:t xml:space="preserve">Small dataset: </w:t>
       </w:r>
       <w:r>
-        <w:t xml:space="preserve"> only 768 patients meant a real risk of overfitting, managed w</w:t>
-      </w:r>
-      <w:r>
-        <w:t xml:space="preserve">ith Dropout, </w:t>
+        <w:t xml:space="preserve"> only 768 patients meant a real risk of overfitting, managed with Dropout, </w:t>
       </w:r>
       <w:proofErr w:type="spellStart"/>
       <w:r>
@@ -1264,10 +1118,36 @@
         <w:spacing w:after="120" w:line="280" w:lineRule="auto"/>
       </w:pPr>
       <w:r>
-        <w:t>This project showed that an ANN can predict diabetes risk fairly well using simple health data, with gl</w:t>
-      </w:r>
-      <w:r>
-        <w:t>ucose as the strongest single predictor. With more data and tuning, such a model could help flag patients for early testing — though it is not a replacement for a real medical diagnosis.</w:t>
+        <w:t>This project showed that an ANN can predict diabetes risk fairly well using simple health data, with glucose as the strongest single predictor. With more data and tuning, such a model could help flag patients for early testing — though it is not a replacement for a real medical diagnosis.</w:t>
+      </w:r>
+    </w:p>
+    <w:p>
+      <w:pPr>
+        <w:spacing w:after="120" w:line="280" w:lineRule="auto"/>
+        <w:rPr>
+          <w:sz w:val="28"/>
+          <w:szCs w:val="28"/>
+          <w:u w:val="single"/>
+        </w:rPr>
+      </w:pPr>
+      <w:r>
+        <w:rPr>
+          <w:sz w:val="28"/>
+          <w:szCs w:val="28"/>
+          <w:u w:val="single"/>
+        </w:rPr>
+        <w:t>8.Github_Link:</w:t>
+      </w:r>
+    </w:p>
+    <w:p>
+      <w:pPr>
+        <w:spacing w:after="120" w:line="280" w:lineRule="auto"/>
+      </w:pPr>
+      <w:r>
+        <w:t xml:space="preserve">Link:  </w:t>
+      </w:r>
+      <w:r>
+        <w:t>https://github.com/kemmy-kk-web/GENAI_2026/tree/master/1.5_introduction_to_dl</w:t>
       </w:r>
     </w:p>
     <w:sectPr>

</xml_diff>